<commit_message>
Added database tests to Outlet_APIs.docx.
</commit_message>
<xml_diff>
--- a/Portal_Database_Design/Outlet_APIs.docx
+++ b/Portal_Database_Design/Outlet_APIs.docx
@@ -16,17 +16,17 @@
         </w:tblCellMar>
       </w:tblPr>
       <w:tblGrid>
-        <w:gridCol w:w="1925"/>
-        <w:gridCol w:w="1930"/>
-        <w:gridCol w:w="1925"/>
-        <w:gridCol w:w="1930"/>
+        <w:gridCol w:w="1924"/>
+        <w:gridCol w:w="1931"/>
+        <w:gridCol w:w="1924"/>
+        <w:gridCol w:w="1931"/>
         <w:gridCol w:w="1928"/>
       </w:tblGrid>
       <w:tr>
         <w:trPr/>
         <w:tc>
           <w:tcPr>
-            <w:tcW w:w="1925" w:type="dxa"/>
+            <w:tcW w:w="1924" w:type="dxa"/>
             <w:tcBorders>
               <w:top w:val="single" w:sz="4" w:space="0" w:color="000000"/>
               <w:start w:val="single" w:sz="4" w:space="0" w:color="000000"/>
@@ -76,7 +76,7 @@
         </w:tc>
         <w:tc>
           <w:tcPr>
-            <w:tcW w:w="1930" w:type="dxa"/>
+            <w:tcW w:w="1931" w:type="dxa"/>
             <w:tcBorders>
               <w:top w:val="single" w:sz="4" w:space="0" w:color="000000"/>
               <w:start w:val="single" w:sz="4" w:space="0" w:color="000000"/>
@@ -126,7 +126,7 @@
         </w:tc>
         <w:tc>
           <w:tcPr>
-            <w:tcW w:w="1925" w:type="dxa"/>
+            <w:tcW w:w="1924" w:type="dxa"/>
             <w:tcBorders>
               <w:top w:val="single" w:sz="4" w:space="0" w:color="000000"/>
               <w:start w:val="single" w:sz="4" w:space="0" w:color="000000"/>
@@ -176,7 +176,7 @@
         </w:tc>
         <w:tc>
           <w:tcPr>
-            <w:tcW w:w="1930" w:type="dxa"/>
+            <w:tcW w:w="1931" w:type="dxa"/>
             <w:tcBorders>
               <w:top w:val="single" w:sz="4" w:space="0" w:color="000000"/>
               <w:start w:val="single" w:sz="4" w:space="0" w:color="000000"/>
@@ -280,7 +280,7 @@
         <w:trPr/>
         <w:tc>
           <w:tcPr>
-            <w:tcW w:w="1925" w:type="dxa"/>
+            <w:tcW w:w="1924" w:type="dxa"/>
             <w:tcBorders>
               <w:start w:val="single" w:sz="4" w:space="0" w:color="000000"/>
               <w:bottom w:val="single" w:sz="4" w:space="0" w:color="000000"/>
@@ -329,7 +329,7 @@
         </w:tc>
         <w:tc>
           <w:tcPr>
-            <w:tcW w:w="1930" w:type="dxa"/>
+            <w:tcW w:w="1931" w:type="dxa"/>
             <w:tcBorders>
               <w:start w:val="single" w:sz="4" w:space="0" w:color="000000"/>
               <w:bottom w:val="single" w:sz="4" w:space="0" w:color="000000"/>
@@ -378,7 +378,7 @@
         </w:tc>
         <w:tc>
           <w:tcPr>
-            <w:tcW w:w="1925" w:type="dxa"/>
+            <w:tcW w:w="1924" w:type="dxa"/>
             <w:tcBorders>
               <w:start w:val="single" w:sz="4" w:space="0" w:color="000000"/>
               <w:bottom w:val="single" w:sz="4" w:space="0" w:color="000000"/>
@@ -427,7 +427,7 @@
         </w:tc>
         <w:tc>
           <w:tcPr>
-            <w:tcW w:w="1930" w:type="dxa"/>
+            <w:tcW w:w="1931" w:type="dxa"/>
             <w:tcBorders>
               <w:start w:val="single" w:sz="4" w:space="0" w:color="000000"/>
               <w:bottom w:val="single" w:sz="4" w:space="0" w:color="000000"/>
@@ -529,7 +529,7 @@
         <w:trPr/>
         <w:tc>
           <w:tcPr>
-            <w:tcW w:w="1925" w:type="dxa"/>
+            <w:tcW w:w="1924" w:type="dxa"/>
             <w:tcBorders>
               <w:start w:val="single" w:sz="4" w:space="0" w:color="000000"/>
               <w:bottom w:val="single" w:sz="4" w:space="0" w:color="000000"/>
@@ -578,7 +578,7 @@
         </w:tc>
         <w:tc>
           <w:tcPr>
-            <w:tcW w:w="1930" w:type="dxa"/>
+            <w:tcW w:w="1931" w:type="dxa"/>
             <w:tcBorders>
               <w:start w:val="single" w:sz="4" w:space="0" w:color="000000"/>
               <w:bottom w:val="single" w:sz="4" w:space="0" w:color="000000"/>
@@ -627,7 +627,7 @@
         </w:tc>
         <w:tc>
           <w:tcPr>
-            <w:tcW w:w="1925" w:type="dxa"/>
+            <w:tcW w:w="1924" w:type="dxa"/>
             <w:tcBorders>
               <w:start w:val="single" w:sz="4" w:space="0" w:color="000000"/>
               <w:bottom w:val="single" w:sz="4" w:space="0" w:color="000000"/>
@@ -676,7 +676,7 @@
         </w:tc>
         <w:tc>
           <w:tcPr>
-            <w:tcW w:w="1930" w:type="dxa"/>
+            <w:tcW w:w="1931" w:type="dxa"/>
             <w:tcBorders>
               <w:start w:val="single" w:sz="4" w:space="0" w:color="000000"/>
               <w:bottom w:val="single" w:sz="4" w:space="0" w:color="000000"/>
@@ -778,7 +778,7 @@
         <w:trPr/>
         <w:tc>
           <w:tcPr>
-            <w:tcW w:w="1925" w:type="dxa"/>
+            <w:tcW w:w="1924" w:type="dxa"/>
             <w:tcBorders>
               <w:start w:val="single" w:sz="4" w:space="0" w:color="000000"/>
               <w:bottom w:val="single" w:sz="4" w:space="0" w:color="000000"/>
@@ -827,7 +827,7 @@
         </w:tc>
         <w:tc>
           <w:tcPr>
-            <w:tcW w:w="1930" w:type="dxa"/>
+            <w:tcW w:w="1931" w:type="dxa"/>
             <w:tcBorders>
               <w:start w:val="single" w:sz="4" w:space="0" w:color="000000"/>
               <w:bottom w:val="single" w:sz="4" w:space="0" w:color="000000"/>
@@ -876,7 +876,7 @@
         </w:tc>
         <w:tc>
           <w:tcPr>
-            <w:tcW w:w="1925" w:type="dxa"/>
+            <w:tcW w:w="1924" w:type="dxa"/>
             <w:tcBorders>
               <w:start w:val="single" w:sz="4" w:space="0" w:color="000000"/>
               <w:bottom w:val="single" w:sz="4" w:space="0" w:color="000000"/>
@@ -925,7 +925,7 @@
         </w:tc>
         <w:tc>
           <w:tcPr>
-            <w:tcW w:w="1930" w:type="dxa"/>
+            <w:tcW w:w="1931" w:type="dxa"/>
             <w:tcBorders>
               <w:start w:val="single" w:sz="4" w:space="0" w:color="000000"/>
               <w:bottom w:val="single" w:sz="4" w:space="0" w:color="000000"/>
@@ -1027,7 +1027,7 @@
         <w:trPr/>
         <w:tc>
           <w:tcPr>
-            <w:tcW w:w="1925" w:type="dxa"/>
+            <w:tcW w:w="1924" w:type="dxa"/>
             <w:tcBorders>
               <w:start w:val="single" w:sz="4" w:space="0" w:color="000000"/>
               <w:bottom w:val="single" w:sz="4" w:space="0" w:color="000000"/>
@@ -1076,7 +1076,7 @@
         </w:tc>
         <w:tc>
           <w:tcPr>
-            <w:tcW w:w="1930" w:type="dxa"/>
+            <w:tcW w:w="1931" w:type="dxa"/>
             <w:tcBorders>
               <w:start w:val="single" w:sz="4" w:space="0" w:color="000000"/>
               <w:bottom w:val="single" w:sz="4" w:space="0" w:color="000000"/>
@@ -1125,7 +1125,7 @@
         </w:tc>
         <w:tc>
           <w:tcPr>
-            <w:tcW w:w="1925" w:type="dxa"/>
+            <w:tcW w:w="1924" w:type="dxa"/>
             <w:tcBorders>
               <w:start w:val="single" w:sz="4" w:space="0" w:color="000000"/>
               <w:bottom w:val="single" w:sz="4" w:space="0" w:color="000000"/>
@@ -1174,7 +1174,7 @@
         </w:tc>
         <w:tc>
           <w:tcPr>
-            <w:tcW w:w="1930" w:type="dxa"/>
+            <w:tcW w:w="1931" w:type="dxa"/>
             <w:tcBorders>
               <w:start w:val="single" w:sz="4" w:space="0" w:color="000000"/>
               <w:bottom w:val="single" w:sz="4" w:space="0" w:color="000000"/>
@@ -1276,7 +1276,7 @@
         <w:trPr/>
         <w:tc>
           <w:tcPr>
-            <w:tcW w:w="1925" w:type="dxa"/>
+            <w:tcW w:w="1924" w:type="dxa"/>
             <w:tcBorders>
               <w:start w:val="single" w:sz="4" w:space="0" w:color="000000"/>
               <w:bottom w:val="single" w:sz="4" w:space="0" w:color="000000"/>
@@ -1325,7 +1325,7 @@
         </w:tc>
         <w:tc>
           <w:tcPr>
-            <w:tcW w:w="1930" w:type="dxa"/>
+            <w:tcW w:w="1931" w:type="dxa"/>
             <w:tcBorders>
               <w:start w:val="single" w:sz="4" w:space="0" w:color="000000"/>
               <w:bottom w:val="single" w:sz="4" w:space="0" w:color="000000"/>
@@ -1374,7 +1374,7 @@
         </w:tc>
         <w:tc>
           <w:tcPr>
-            <w:tcW w:w="1925" w:type="dxa"/>
+            <w:tcW w:w="1924" w:type="dxa"/>
             <w:tcBorders>
               <w:start w:val="single" w:sz="4" w:space="0" w:color="000000"/>
               <w:bottom w:val="single" w:sz="4" w:space="0" w:color="000000"/>
@@ -1423,7 +1423,7 @@
         </w:tc>
         <w:tc>
           <w:tcPr>
-            <w:tcW w:w="1930" w:type="dxa"/>
+            <w:tcW w:w="1931" w:type="dxa"/>
             <w:tcBorders>
               <w:start w:val="single" w:sz="4" w:space="0" w:color="000000"/>
               <w:bottom w:val="single" w:sz="4" w:space="0" w:color="000000"/>
@@ -1525,7 +1525,7 @@
         <w:trPr/>
         <w:tc>
           <w:tcPr>
-            <w:tcW w:w="1925" w:type="dxa"/>
+            <w:tcW w:w="1924" w:type="dxa"/>
             <w:tcBorders>
               <w:start w:val="single" w:sz="4" w:space="0" w:color="000000"/>
               <w:bottom w:val="single" w:sz="4" w:space="0" w:color="000000"/>
@@ -1574,7 +1574,7 @@
         </w:tc>
         <w:tc>
           <w:tcPr>
-            <w:tcW w:w="1930" w:type="dxa"/>
+            <w:tcW w:w="1931" w:type="dxa"/>
             <w:tcBorders>
               <w:start w:val="single" w:sz="4" w:space="0" w:color="000000"/>
               <w:bottom w:val="single" w:sz="4" w:space="0" w:color="000000"/>
@@ -1623,7 +1623,7 @@
         </w:tc>
         <w:tc>
           <w:tcPr>
-            <w:tcW w:w="1925" w:type="dxa"/>
+            <w:tcW w:w="1924" w:type="dxa"/>
             <w:tcBorders>
               <w:start w:val="single" w:sz="4" w:space="0" w:color="000000"/>
               <w:bottom w:val="single" w:sz="4" w:space="0" w:color="000000"/>
@@ -1672,7 +1672,7 @@
         </w:tc>
         <w:tc>
           <w:tcPr>
-            <w:tcW w:w="1930" w:type="dxa"/>
+            <w:tcW w:w="1931" w:type="dxa"/>
             <w:tcBorders>
               <w:start w:val="single" w:sz="4" w:space="0" w:color="000000"/>
               <w:bottom w:val="single" w:sz="4" w:space="0" w:color="000000"/>
@@ -1791,15 +1791,7 @@
       </w:pPr>
       <w:r>
         <w:rPr/>
-        <w:t>For Create</w:t>
-      </w:r>
-      <w:r>
-        <w:rPr/>
-        <w:t>Outlet</w:t>
-      </w:r>
-      <w:r>
-        <w:rPr/>
-        <w:t>, the following tests:</w:t>
+        <w:t>For CreateOutlet, the following tests:</w:t>
       </w:r>
     </w:p>
     <w:p>
@@ -1823,51 +1815,19 @@
       </w:pPr>
       <w:r>
         <w:rPr/>
-        <w:t>* Create a</w:t>
-      </w:r>
-      <w:r>
-        <w:rPr/>
-        <w:t>n OUTLET</w:t>
-      </w:r>
-      <w:r>
-        <w:rPr/>
-        <w:t xml:space="preserve"> tuple with data in all non-null attributes.</w:t>
-      </w:r>
-    </w:p>
-    <w:p>
-      <w:pPr>
-        <w:pStyle w:val="Normal"/>
-        <w:bidi w:val="0"/>
-        <w:jc w:val="start"/>
-        <w:rPr/>
-      </w:pPr>
-      <w:r>
-        <w:rPr/>
-        <w:t>* Create a</w:t>
-      </w:r>
-      <w:r>
-        <w:rPr/>
-        <w:t>n</w:t>
-      </w:r>
-      <w:r>
-        <w:rPr/>
-        <w:t xml:space="preserve"> </w:t>
-      </w:r>
-      <w:r>
-        <w:rPr/>
-        <w:t>OUTLET</w:t>
-      </w:r>
-      <w:r>
-        <w:rPr/>
-        <w:t xml:space="preserve"> tuple without the </w:t>
-      </w:r>
-      <w:r>
-        <w:rPr/>
-        <w:t>outlet</w:t>
-      </w:r>
-      <w:r>
-        <w:rPr/>
-        <w:t>_name.</w:t>
+        <w:t>* Create an OUTLET tuple with data in all non-null attributes.</w:t>
+      </w:r>
+    </w:p>
+    <w:p>
+      <w:pPr>
+        <w:pStyle w:val="Normal"/>
+        <w:bidi w:val="0"/>
+        <w:jc w:val="start"/>
+        <w:rPr/>
+      </w:pPr>
+      <w:r>
+        <w:rPr/>
+        <w:t>* Create an OUTLET tuple without the outlet_name.</w:t>
       </w:r>
     </w:p>
     <w:p>
@@ -1880,31 +1840,7 @@
       <w:bookmarkStart w:id="0" w:name="__DdeLink__92_3803631280"/>
       <w:r>
         <w:rPr/>
-        <w:t>* Create a</w:t>
-      </w:r>
-      <w:r>
-        <w:rPr/>
-        <w:t>n</w:t>
-      </w:r>
-      <w:r>
-        <w:rPr/>
-        <w:t xml:space="preserve"> </w:t>
-      </w:r>
-      <w:r>
-        <w:rPr/>
-        <w:t>OUTLET</w:t>
-      </w:r>
-      <w:r>
-        <w:rPr/>
-        <w:t xml:space="preserve"> tuple without the </w:t>
-      </w:r>
-      <w:r>
-        <w:rPr/>
-        <w:t>outlet</w:t>
-      </w:r>
-      <w:r>
-        <w:rPr/>
-        <w:t>_address_city.</w:t>
+        <w:t>* Create an OUTLET tuple without the outlet_address_city.</w:t>
       </w:r>
       <w:bookmarkEnd w:id="0"/>
     </w:p>
@@ -1917,31 +1853,7 @@
       </w:pPr>
       <w:r>
         <w:rPr/>
-        <w:t>* Create a</w:t>
-      </w:r>
-      <w:r>
-        <w:rPr/>
-        <w:t>n</w:t>
-      </w:r>
-      <w:r>
-        <w:rPr/>
-        <w:t xml:space="preserve"> </w:t>
-      </w:r>
-      <w:r>
-        <w:rPr/>
-        <w:t>OUTLET</w:t>
-      </w:r>
-      <w:r>
-        <w:rPr/>
-        <w:t xml:space="preserve"> tuple without the </w:t>
-      </w:r>
-      <w:r>
-        <w:rPr/>
-        <w:t>outlet</w:t>
-      </w:r>
-      <w:r>
-        <w:rPr/>
-        <w:t>_address_post_code.</w:t>
+        <w:t>* Create an OUTLET tuple without the outlet_address_post_code.</w:t>
       </w:r>
     </w:p>
     <w:p>
@@ -1988,15 +1900,7 @@
       </w:pPr>
       <w:r>
         <w:rPr/>
-        <w:t>For Update</w:t>
-      </w:r>
-      <w:r>
-        <w:rPr/>
-        <w:t>Outlet</w:t>
-      </w:r>
-      <w:r>
-        <w:rPr/>
-        <w:t>Name, the following tests:</w:t>
+        <w:t>For UpdateOutletName, the following tests:</w:t>
       </w:r>
     </w:p>
     <w:p>
@@ -2020,173 +1924,271 @@
       </w:pPr>
       <w:r>
         <w:rPr/>
-        <w:t xml:space="preserve">* Update </w:t>
-      </w:r>
-      <w:r>
-        <w:rPr/>
-        <w:t>the</w:t>
-      </w:r>
-      <w:r>
-        <w:rPr/>
-        <w:t xml:space="preserve"> </w:t>
-      </w:r>
-      <w:r>
-        <w:rPr/>
-        <w:t>OUTLET</w:t>
-      </w:r>
-      <w:r>
-        <w:rPr/>
-        <w:t xml:space="preserve"> </w:t>
-      </w:r>
-      <w:r>
-        <w:rPr/>
-        <w:t xml:space="preserve">that has outlet_id = </w:t>
-      </w:r>
-      <w:r>
-        <w:rPr/>
-        <w:t>7</w:t>
-      </w:r>
+        <w:t>* Update the OUTLET that has outlet_id = 7, its outlet_name with 1234.</w:t>
+      </w:r>
+    </w:p>
+    <w:p>
+      <w:pPr>
+        <w:pStyle w:val="Normal"/>
+        <w:bidi w:val="0"/>
+        <w:jc w:val="start"/>
+        <w:rPr/>
+      </w:pPr>
+      <w:r>
+        <w:rPr/>
+        <w:t>* Update an OUTLET that has outlet_id = 7, its outlet_name “Test Outlet # 1” containing letters and numbers.</w:t>
+      </w:r>
+    </w:p>
+    <w:p>
+      <w:pPr>
+        <w:pStyle w:val="Normal"/>
+        <w:bidi w:val="0"/>
+        <w:jc w:val="start"/>
+        <w:rPr/>
+      </w:pPr>
+      <w:r>
+        <w:rPr/>
+        <w:t>* Update an OUTLET that has outlet_id = 7, its outlet_name with a “Test Outlet” containing letters only.</w:t>
+      </w:r>
+    </w:p>
+    <w:p>
+      <w:pPr>
+        <w:pStyle w:val="Normal"/>
+        <w:bidi w:val="0"/>
+        <w:jc w:val="start"/>
+        <w:rPr/>
+      </w:pPr>
+      <w:r>
+        <w:rPr/>
+      </w:r>
+    </w:p>
+    <w:p>
+      <w:pPr>
+        <w:pStyle w:val="Normal"/>
+        <w:bidi w:val="0"/>
+        <w:jc w:val="start"/>
+        <w:rPr/>
+      </w:pPr>
+      <w:bookmarkStart w:id="1" w:name="__DdeLink__100_3803631280"/>
+      <w:r>
+        <w:rPr/>
+        <w:t>For UpdateOutletAddress, the following tests:</w:t>
+      </w:r>
+      <w:bookmarkEnd w:id="1"/>
+    </w:p>
+    <w:p>
+      <w:pPr>
+        <w:pStyle w:val="Normal"/>
+        <w:bidi w:val="0"/>
+        <w:jc w:val="start"/>
+        <w:rPr/>
+      </w:pPr>
+      <w:r>
+        <w:rPr/>
+        <w:t>* Send an empty request body.</w:t>
+      </w:r>
+    </w:p>
+    <w:p>
+      <w:pPr>
+        <w:pStyle w:val="Normal"/>
+        <w:bidi w:val="0"/>
+        <w:jc w:val="start"/>
+        <w:rPr/>
+      </w:pPr>
+      <w:bookmarkStart w:id="2" w:name="__DdeLink__94_3803631280"/>
+      <w:r>
+        <w:rPr/>
+        <w:t xml:space="preserve">* Update the OUTLET that has outlet_id = 7 </w:t>
+      </w:r>
+      <w:bookmarkStart w:id="3" w:name="__DdeLink__307_1992960000"/>
       <w:r>
         <w:rPr/>
         <w:t>, its</w:t>
       </w:r>
-      <w:r>
-        <w:rPr/>
-        <w:t xml:space="preserve"> </w:t>
-      </w:r>
-      <w:r>
-        <w:rPr/>
-        <w:t>outlet</w:t>
-      </w:r>
-      <w:r>
-        <w:rPr/>
-        <w:t>_name with 1234.</w:t>
-      </w:r>
-    </w:p>
-    <w:p>
-      <w:pPr>
-        <w:pStyle w:val="Normal"/>
-        <w:bidi w:val="0"/>
-        <w:jc w:val="start"/>
-        <w:rPr/>
-      </w:pPr>
-      <w:r>
-        <w:rPr/>
-        <w:t>* Update a</w:t>
-      </w:r>
-      <w:r>
-        <w:rPr/>
-        <w:t>n OUTLET that has outlet_id =</w:t>
-      </w:r>
-      <w:r>
-        <w:rPr/>
-        <w:t xml:space="preserve"> </w:t>
-      </w:r>
-      <w:r>
-        <w:rPr/>
-        <w:t>7</w:t>
-      </w:r>
-      <w:r>
-        <w:rPr/>
-        <w:t xml:space="preserve">, </w:t>
-      </w:r>
-      <w:r>
-        <w:rPr/>
-        <w:t>its outlet</w:t>
-      </w:r>
-      <w:r>
-        <w:rPr/>
-        <w:t>_name “</w:t>
-      </w:r>
-      <w:r>
-        <w:rPr/>
-        <w:t>Test Outlet # 1</w:t>
-      </w:r>
-      <w:r>
-        <w:rPr/>
-        <w:t>” containing letters and numbers.</w:t>
-      </w:r>
-    </w:p>
-    <w:p>
-      <w:pPr>
-        <w:pStyle w:val="Normal"/>
-        <w:bidi w:val="0"/>
-        <w:jc w:val="start"/>
-        <w:rPr/>
-      </w:pPr>
-      <w:r>
-        <w:rPr/>
-        <w:t>* Update a</w:t>
-      </w:r>
-      <w:r>
-        <w:rPr/>
-        <w:t>n</w:t>
-      </w:r>
-      <w:r>
-        <w:rPr/>
-        <w:t xml:space="preserve"> </w:t>
-      </w:r>
-      <w:r>
-        <w:rPr/>
-        <w:t xml:space="preserve">OUTLET that has outlet_id = </w:t>
-      </w:r>
-      <w:r>
-        <w:rPr/>
-        <w:t>7</w:t>
-      </w:r>
-      <w:r>
-        <w:rPr/>
-        <w:t xml:space="preserve">, </w:t>
-      </w:r>
-      <w:r>
-        <w:rPr/>
-        <w:t>its outlet</w:t>
-      </w:r>
-      <w:r>
-        <w:rPr/>
-        <w:t>_name with a “</w:t>
-      </w:r>
-      <w:r>
-        <w:rPr/>
-        <w:t>Test Outlet</w:t>
-      </w:r>
-      <w:r>
-        <w:rPr/>
-        <w:t>” containing letters only.</w:t>
-      </w:r>
-    </w:p>
-    <w:p>
-      <w:pPr>
-        <w:pStyle w:val="Normal"/>
-        <w:bidi w:val="0"/>
-        <w:jc w:val="start"/>
-        <w:rPr/>
-      </w:pPr>
-      <w:r>
-        <w:rPr/>
-      </w:r>
-    </w:p>
-    <w:p>
-      <w:pPr>
-        <w:pStyle w:val="Normal"/>
-        <w:bidi w:val="0"/>
-        <w:jc w:val="start"/>
-        <w:rPr/>
-      </w:pPr>
-      <w:bookmarkStart w:id="1" w:name="__DdeLink__100_3803631280"/>
-      <w:r>
-        <w:rPr/>
-        <w:t>For Update</w:t>
-      </w:r>
-      <w:r>
-        <w:rPr/>
-        <w:t>Outlet</w:t>
-      </w:r>
-      <w:r>
-        <w:rPr/>
-        <w:t>Address, the following tests:</w:t>
-      </w:r>
-      <w:bookmarkEnd w:id="1"/>
+      <w:bookmarkEnd w:id="3"/>
+      <w:r>
+        <w:rPr/>
+        <w:t xml:space="preserve"> outlet_address_city to “Test City”.</w:t>
+      </w:r>
+      <w:bookmarkEnd w:id="2"/>
+    </w:p>
+    <w:p>
+      <w:pPr>
+        <w:pStyle w:val="Normal"/>
+        <w:bidi w:val="0"/>
+        <w:jc w:val="start"/>
+        <w:rPr/>
+      </w:pPr>
+      <w:r>
+        <w:rPr/>
+        <w:t xml:space="preserve">* </w:t>
+      </w:r>
+      <w:bookmarkStart w:id="4" w:name="__DdeLink__96_3803631280"/>
+      <w:r>
+        <w:rPr/>
+        <w:t xml:space="preserve">Update the OUTLET </w:t>
+      </w:r>
+      <w:bookmarkStart w:id="5" w:name="__DdeLink__305_1992960000"/>
+      <w:r>
+        <w:rPr/>
+        <w:t>that has outlet_id =</w:t>
+      </w:r>
+      <w:bookmarkEnd w:id="5"/>
+      <w:r>
+        <w:rPr/>
+        <w:t xml:space="preserve"> 7, its outlet_address_stree</w:t>
+      </w:r>
+      <w:bookmarkEnd w:id="4"/>
+      <w:r>
+        <w:rPr/>
+        <w:t>t to “Test Street 1”.</w:t>
+      </w:r>
+    </w:p>
+    <w:p>
+      <w:pPr>
+        <w:pStyle w:val="Normal"/>
+        <w:bidi w:val="0"/>
+        <w:jc w:val="start"/>
+        <w:rPr/>
+      </w:pPr>
+      <w:bookmarkStart w:id="6" w:name="__DdeLink__98_3803631280"/>
+      <w:r>
+        <w:rPr/>
+        <w:t>* Update the OUTLET that has outlet_id = 7, its outlet_address_country to “Test Country”.</w:t>
+      </w:r>
+      <w:bookmarkEnd w:id="6"/>
+    </w:p>
+    <w:p>
+      <w:pPr>
+        <w:pStyle w:val="Normal"/>
+        <w:bidi w:val="0"/>
+        <w:jc w:val="start"/>
+        <w:rPr/>
+      </w:pPr>
+      <w:r>
+        <w:rPr/>
+        <w:t>* Update the OUTLET that has outlet_id = 7, its outlet_address_admin_division to “Test Admin Division”.</w:t>
+      </w:r>
+    </w:p>
+    <w:p>
+      <w:pPr>
+        <w:pStyle w:val="Normal"/>
+        <w:bidi w:val="0"/>
+        <w:jc w:val="start"/>
+        <w:rPr/>
+      </w:pPr>
+      <w:r>
+        <w:rPr/>
+        <w:t>* Update the OUTLET that has outlet_id = 7, its outlet_address_post_code to “1234”.</w:t>
+      </w:r>
+    </w:p>
+    <w:p>
+      <w:pPr>
+        <w:pStyle w:val="Normal"/>
+        <w:bidi w:val="0"/>
+        <w:jc w:val="start"/>
+        <w:rPr/>
+      </w:pPr>
+      <w:r>
+        <w:rPr/>
+      </w:r>
+    </w:p>
+    <w:p>
+      <w:pPr>
+        <w:pStyle w:val="Normal"/>
+        <w:bidi w:val="0"/>
+        <w:jc w:val="start"/>
+        <w:rPr/>
+      </w:pPr>
+      <w:r>
+        <w:rPr/>
+        <w:t>For searchOutletsByName, the following tests:</w:t>
+      </w:r>
+    </w:p>
+    <w:p>
+      <w:pPr>
+        <w:pStyle w:val="Normal"/>
+        <w:bidi w:val="0"/>
+        <w:jc w:val="start"/>
+        <w:rPr/>
+      </w:pPr>
+      <w:r>
+        <w:rPr/>
+        <w:t>* Search for “T”</w:t>
+      </w:r>
+    </w:p>
+    <w:p>
+      <w:pPr>
+        <w:pStyle w:val="Normal"/>
+        <w:bidi w:val="0"/>
+        <w:jc w:val="start"/>
+        <w:rPr/>
+      </w:pPr>
+      <w:r>
+        <w:rPr/>
+        <w:t>* Search for “Ti”</w:t>
+      </w:r>
+    </w:p>
+    <w:p>
+      <w:pPr>
+        <w:pStyle w:val="Normal"/>
+        <w:bidi w:val="0"/>
+        <w:jc w:val="start"/>
+        <w:rPr/>
+      </w:pPr>
+      <w:r>
+        <w:rPr/>
+        <w:t>* Search for “Tim”</w:t>
+      </w:r>
+    </w:p>
+    <w:p>
+      <w:pPr>
+        <w:pStyle w:val="Normal"/>
+        <w:bidi w:val="0"/>
+        <w:jc w:val="start"/>
+        <w:rPr/>
+      </w:pPr>
+      <w:r>
+        <w:rPr/>
+        <w:t>* Search for “Ts”</w:t>
+      </w:r>
+    </w:p>
+    <w:p>
+      <w:pPr>
+        <w:pStyle w:val="Normal"/>
+        <w:bidi w:val="0"/>
+        <w:jc w:val="start"/>
+        <w:rPr/>
+      </w:pPr>
+      <w:r>
+        <w:rPr/>
+        <w:t>* Search for “#”</w:t>
+      </w:r>
+    </w:p>
+    <w:p>
+      <w:pPr>
+        <w:pStyle w:val="Normal"/>
+        <w:bidi w:val="0"/>
+        <w:jc w:val="start"/>
+        <w:rPr/>
+      </w:pPr>
+      <w:r>
+        <w:rPr/>
+      </w:r>
+    </w:p>
+    <w:p>
+      <w:pPr>
+        <w:pStyle w:val="Normal"/>
+        <w:bidi w:val="0"/>
+        <w:jc w:val="start"/>
+        <w:rPr/>
+      </w:pPr>
+      <w:bookmarkStart w:id="7" w:name="__DdeLink__139_2312781727"/>
+      <w:bookmarkStart w:id="8" w:name="__DdeLink__142_2312781727"/>
+      <w:r>
+        <w:rPr/>
+        <w:t>For removeOutlet, the following tests:</w:t>
+      </w:r>
     </w:p>
     <w:p>
       <w:pPr>
@@ -2207,58 +2209,49 @@
         <w:jc w:val="start"/>
         <w:rPr/>
       </w:pPr>
-      <w:bookmarkStart w:id="2" w:name="__DdeLink__94_3803631280"/>
-      <w:r>
-        <w:rPr/>
-        <w:t xml:space="preserve">* Update the </w:t>
-      </w:r>
-      <w:r>
-        <w:rPr/>
-        <w:t>OUTLET</w:t>
-      </w:r>
-      <w:r>
-        <w:rPr/>
-        <w:t xml:space="preserve"> </w:t>
-      </w:r>
-      <w:r>
-        <w:rPr/>
-        <w:t xml:space="preserve">that has outlet_id = </w:t>
-      </w:r>
-      <w:r>
-        <w:rPr/>
-        <w:t>7</w:t>
-      </w:r>
-      <w:r>
-        <w:rPr/>
-        <w:t xml:space="preserve"> </w:t>
-      </w:r>
-      <w:bookmarkStart w:id="3" w:name="__DdeLink__307_1992960000"/>
-      <w:r>
-        <w:rPr/>
-        <w:t xml:space="preserve">, </w:t>
-      </w:r>
-      <w:r>
-        <w:rPr/>
-        <w:t>its</w:t>
-      </w:r>
-      <w:bookmarkEnd w:id="3"/>
-      <w:r>
-        <w:rPr/>
-        <w:t xml:space="preserve"> outlet</w:t>
-      </w:r>
-      <w:r>
-        <w:rPr/>
-        <w:t xml:space="preserve">_address_city </w:t>
-      </w:r>
-      <w:r>
-        <w:rPr/>
-        <w:t>to “Test City”</w:t>
-      </w:r>
-      <w:r>
-        <w:rPr/>
-        <w:t>.</w:t>
-      </w:r>
-      <w:bookmarkEnd w:id="2"/>
+      <w:r>
+        <w:rPr/>
+        <w:t>* Delete the OUTLET with outlet_id 7.</w:t>
+      </w:r>
+    </w:p>
+    <w:p>
+      <w:pPr>
+        <w:pStyle w:val="Normal"/>
+        <w:bidi w:val="0"/>
+        <w:jc w:val="start"/>
+        <w:rPr/>
+      </w:pPr>
+      <w:bookmarkStart w:id="9" w:name="__DdeLink__139_2312781727"/>
+      <w:bookmarkStart w:id="10" w:name="__DdeLink__142_2312781727"/>
+      <w:r>
+        <w:rPr/>
+        <w:t>* Delete the OUTLET with outlet_id 8.</w:t>
+      </w:r>
+      <w:bookmarkEnd w:id="9"/>
+      <w:bookmarkEnd w:id="10"/>
+    </w:p>
+    <w:p>
+      <w:pPr>
+        <w:pStyle w:val="Normal"/>
+        <w:bidi w:val="0"/>
+        <w:jc w:val="start"/>
+        <w:rPr/>
+      </w:pPr>
+      <w:r>
+        <w:rPr/>
+      </w:r>
+    </w:p>
+    <w:p>
+      <w:pPr>
+        <w:pStyle w:val="Normal"/>
+        <w:bidi w:val="0"/>
+        <w:jc w:val="center"/>
+        <w:rPr/>
+      </w:pPr>
+      <w:r>
+        <w:rPr/>
+        <w:t>DATABASE TESTS</w:t>
+      </w:r>
     </w:p>
     <w:p>
       <w:pPr>
@@ -2271,367 +2264,178 @@
         <w:rPr/>
         <w:t xml:space="preserve">* </w:t>
       </w:r>
-      <w:bookmarkStart w:id="4" w:name="__DdeLink__96_3803631280"/>
-      <w:r>
-        <w:rPr/>
-        <w:t xml:space="preserve">Update the </w:t>
-      </w:r>
-      <w:r>
-        <w:rPr/>
-        <w:t xml:space="preserve">OUTLET </w:t>
-      </w:r>
-      <w:bookmarkStart w:id="5" w:name="__DdeLink__305_1992960000"/>
-      <w:r>
-        <w:rPr/>
-        <w:t>that has outlet_id =</w:t>
-      </w:r>
-      <w:bookmarkEnd w:id="5"/>
-      <w:r>
-        <w:rPr/>
-        <w:t xml:space="preserve"> </w:t>
-      </w:r>
-      <w:r>
-        <w:rPr/>
-        <w:t>7</w:t>
-      </w:r>
-      <w:r>
-        <w:rPr/>
-        <w:t xml:space="preserve">, </w:t>
-      </w:r>
-      <w:r>
-        <w:rPr/>
-        <w:t>its outlet</w:t>
-      </w:r>
-      <w:r>
-        <w:rPr/>
-        <w:t>_address_stree</w:t>
-      </w:r>
-      <w:bookmarkEnd w:id="4"/>
-      <w:r>
-        <w:rPr/>
-        <w:t>t to “Test Street 1”</w:t>
-      </w:r>
-      <w:r>
-        <w:rPr/>
-        <w:t>.</w:t>
-      </w:r>
-    </w:p>
-    <w:p>
-      <w:pPr>
-        <w:pStyle w:val="Normal"/>
-        <w:bidi w:val="0"/>
-        <w:jc w:val="start"/>
-        <w:rPr/>
-      </w:pPr>
-      <w:bookmarkStart w:id="6" w:name="__DdeLink__98_3803631280"/>
-      <w:r>
-        <w:rPr/>
-        <w:t xml:space="preserve">* Update the </w:t>
-      </w:r>
-      <w:r>
-        <w:rPr/>
-        <w:t>OUTLET that has outlet_id =</w:t>
-      </w:r>
-      <w:r>
-        <w:rPr/>
-        <w:t xml:space="preserve"> </w:t>
-      </w:r>
-      <w:r>
-        <w:rPr/>
-        <w:t>7</w:t>
-      </w:r>
-      <w:r>
-        <w:rPr/>
-        <w:t xml:space="preserve">, </w:t>
-      </w:r>
-      <w:r>
-        <w:rPr/>
-        <w:t>its outlet</w:t>
-      </w:r>
-      <w:r>
-        <w:rPr/>
-        <w:t xml:space="preserve">_address_country </w:t>
-      </w:r>
-      <w:r>
-        <w:rPr/>
-        <w:t>to “Test Country”</w:t>
-      </w:r>
-      <w:r>
-        <w:rPr/>
-        <w:t>.</w:t>
-      </w:r>
-      <w:bookmarkEnd w:id="6"/>
-    </w:p>
-    <w:p>
-      <w:pPr>
-        <w:pStyle w:val="Normal"/>
-        <w:bidi w:val="0"/>
-        <w:jc w:val="start"/>
-        <w:rPr/>
-      </w:pPr>
-      <w:r>
-        <w:rPr/>
-        <w:t xml:space="preserve">* Update the </w:t>
-      </w:r>
-      <w:r>
-        <w:rPr/>
-        <w:t xml:space="preserve">OUTLET that has outlet_id = </w:t>
-      </w:r>
-      <w:r>
-        <w:rPr/>
-        <w:t>7</w:t>
-      </w:r>
-      <w:r>
-        <w:rPr/>
-        <w:t xml:space="preserve">, </w:t>
-      </w:r>
-      <w:r>
-        <w:rPr/>
-        <w:t>its outlet</w:t>
-      </w:r>
-      <w:r>
-        <w:rPr/>
-        <w:t xml:space="preserve">_address_admin_division </w:t>
-      </w:r>
-      <w:r>
-        <w:rPr/>
-        <w:t>to “Test Admin Division”</w:t>
-      </w:r>
-      <w:r>
-        <w:rPr/>
-        <w:t>.</w:t>
-      </w:r>
-    </w:p>
-    <w:p>
-      <w:pPr>
-        <w:pStyle w:val="Normal"/>
-        <w:bidi w:val="0"/>
-        <w:jc w:val="start"/>
-        <w:rPr/>
-      </w:pPr>
-      <w:r>
-        <w:rPr/>
-        <w:t xml:space="preserve">* Update the </w:t>
-      </w:r>
-      <w:r>
-        <w:rPr/>
-        <w:t xml:space="preserve">OUTLET that has outlet_id = </w:t>
-      </w:r>
-      <w:r>
-        <w:rPr/>
-        <w:t>7</w:t>
-      </w:r>
-      <w:r>
-        <w:rPr/>
-        <w:t>, its</w:t>
-      </w:r>
-      <w:r>
-        <w:rPr/>
-        <w:t xml:space="preserve"> </w:t>
-      </w:r>
-      <w:r>
-        <w:rPr/>
-        <w:t>outlet</w:t>
-      </w:r>
-      <w:r>
-        <w:rPr/>
-        <w:t xml:space="preserve">_address_post_code </w:t>
-      </w:r>
-      <w:r>
-        <w:rPr/>
-        <w:t>to “1234”.</w:t>
-      </w:r>
-    </w:p>
-    <w:p>
-      <w:pPr>
-        <w:pStyle w:val="Normal"/>
-        <w:bidi w:val="0"/>
-        <w:jc w:val="start"/>
-        <w:rPr/>
-      </w:pPr>
-      <w:r>
-        <w:rPr/>
-      </w:r>
-    </w:p>
-    <w:p>
-      <w:pPr>
-        <w:pStyle w:val="Normal"/>
-        <w:bidi w:val="0"/>
-        <w:jc w:val="start"/>
-        <w:rPr/>
-      </w:pPr>
-      <w:r>
-        <w:rPr/>
-        <w:t>For searchOutletsByName, the following tests:</w:t>
-      </w:r>
-    </w:p>
-    <w:p>
-      <w:pPr>
-        <w:pStyle w:val="Normal"/>
-        <w:bidi w:val="0"/>
-        <w:jc w:val="start"/>
-        <w:rPr/>
-      </w:pPr>
-      <w:r>
-        <w:rPr/>
-        <w:t>* Search for “T”</w:t>
-      </w:r>
-    </w:p>
-    <w:p>
-      <w:pPr>
-        <w:pStyle w:val="Normal"/>
-        <w:bidi w:val="0"/>
-        <w:jc w:val="start"/>
-        <w:rPr/>
-      </w:pPr>
-      <w:r>
-        <w:rPr/>
-        <w:t>* Search for “Ti”</w:t>
-      </w:r>
-    </w:p>
-    <w:p>
-      <w:pPr>
-        <w:pStyle w:val="Normal"/>
-        <w:bidi w:val="0"/>
-        <w:jc w:val="start"/>
-        <w:rPr/>
-      </w:pPr>
-      <w:r>
-        <w:rPr/>
-        <w:t>* Search for “Tim”</w:t>
-      </w:r>
-    </w:p>
-    <w:p>
-      <w:pPr>
-        <w:pStyle w:val="Normal"/>
-        <w:bidi w:val="0"/>
-        <w:jc w:val="start"/>
-        <w:rPr/>
-      </w:pPr>
-      <w:r>
-        <w:rPr/>
-        <w:t>* Search for “Ts”</w:t>
-      </w:r>
-    </w:p>
-    <w:p>
-      <w:pPr>
-        <w:pStyle w:val="Normal"/>
-        <w:bidi w:val="0"/>
-        <w:jc w:val="start"/>
-        <w:rPr/>
-      </w:pPr>
-      <w:r>
-        <w:rPr/>
-        <w:t>* Search for “#”</w:t>
-      </w:r>
-    </w:p>
-    <w:p>
-      <w:pPr>
-        <w:pStyle w:val="Normal"/>
-        <w:bidi w:val="0"/>
-        <w:jc w:val="start"/>
-        <w:rPr/>
-      </w:pPr>
-      <w:r>
-        <w:rPr/>
-      </w:r>
-    </w:p>
-    <w:p>
-      <w:pPr>
-        <w:pStyle w:val="Normal"/>
-        <w:bidi w:val="0"/>
-        <w:jc w:val="start"/>
-        <w:rPr/>
-      </w:pPr>
-      <w:bookmarkStart w:id="7" w:name="__DdeLink__142_2312781727"/>
-      <w:bookmarkStart w:id="8" w:name="__DdeLink__139_2312781727"/>
-      <w:r>
-        <w:rPr/>
-        <w:t>For remove</w:t>
-      </w:r>
-      <w:r>
-        <w:rPr/>
-        <w:t>Outlet</w:t>
-      </w:r>
-      <w:r>
-        <w:rPr/>
-        <w:t>, the following tests:</w:t>
-      </w:r>
-    </w:p>
-    <w:p>
-      <w:pPr>
-        <w:pStyle w:val="Normal"/>
-        <w:bidi w:val="0"/>
-        <w:jc w:val="start"/>
-        <w:rPr/>
-      </w:pPr>
-      <w:r>
-        <w:rPr/>
-        <w:t>* Send an empty request body.</w:t>
-      </w:r>
-    </w:p>
-    <w:p>
-      <w:pPr>
-        <w:pStyle w:val="Normal"/>
-        <w:bidi w:val="0"/>
-        <w:jc w:val="start"/>
-        <w:rPr/>
-      </w:pPr>
-      <w:r>
-        <w:rPr/>
-        <w:t xml:space="preserve">* Delete the </w:t>
-      </w:r>
-      <w:r>
-        <w:rPr/>
-        <w:t>OUTLET</w:t>
-      </w:r>
-      <w:r>
-        <w:rPr/>
-        <w:t xml:space="preserve"> with </w:t>
-      </w:r>
-      <w:r>
-        <w:rPr/>
-        <w:t>outlet</w:t>
-      </w:r>
-      <w:r>
-        <w:rPr/>
-        <w:t xml:space="preserve">_id </w:t>
-      </w:r>
-      <w:r>
-        <w:rPr/>
-        <w:t>7</w:t>
-      </w:r>
-      <w:r>
-        <w:rPr/>
-        <w:t>.</w:t>
-      </w:r>
-    </w:p>
-    <w:p>
-      <w:pPr>
-        <w:pStyle w:val="Normal"/>
-        <w:bidi w:val="0"/>
-        <w:jc w:val="start"/>
-        <w:rPr/>
-      </w:pPr>
-      <w:r>
-        <w:rPr/>
-        <w:t xml:space="preserve">* Delete the </w:t>
-      </w:r>
-      <w:r>
-        <w:rPr/>
-        <w:t>OUTLET</w:t>
-      </w:r>
-      <w:r>
-        <w:rPr/>
-        <w:t xml:space="preserve"> with </w:t>
-      </w:r>
-      <w:r>
-        <w:rPr/>
-        <w:t>outlet</w:t>
-      </w:r>
-      <w:r>
-        <w:rPr/>
-        <w:t xml:space="preserve">_id </w:t>
+      <w:r>
+        <w:rPr/>
+        <w:t xml:space="preserve">Create </w:t>
+      </w:r>
+      <w:r>
+        <w:rPr/>
+        <w:t>an OUTLET as {</w:t>
+      </w:r>
+    </w:p>
+    <w:p>
+      <w:pPr>
+        <w:pStyle w:val="Normal"/>
+        <w:bidi w:val="0"/>
+        <w:jc w:val="start"/>
+        <w:rPr/>
+      </w:pPr>
+      <w:r>
+        <w:rPr/>
+        <w:tab/>
+        <w:t>"outlet_name": "Tim Hortons Test Outlet 2",</w:t>
+      </w:r>
+    </w:p>
+    <w:p>
+      <w:pPr>
+        <w:pStyle w:val="Normal"/>
+        <w:bidi w:val="0"/>
+        <w:jc w:val="start"/>
+        <w:rPr/>
+      </w:pPr>
+      <w:r>
+        <w:rPr/>
+        <w:t xml:space="preserve">            </w:t>
+      </w:r>
+      <w:r>
+        <w:rPr/>
+        <w:t>"outlet_address_room_no": "</w:t>
+      </w:r>
+      <w:r>
+        <w:rPr/>
+        <w:t>6</w:t>
+      </w:r>
+      <w:r>
+        <w:rPr/>
+        <w:t>",</w:t>
+      </w:r>
+    </w:p>
+    <w:p>
+      <w:pPr>
+        <w:pStyle w:val="Normal"/>
+        <w:bidi w:val="0"/>
+        <w:jc w:val="start"/>
+        <w:rPr/>
+      </w:pPr>
+      <w:r>
+        <w:rPr/>
+        <w:t xml:space="preserve">            </w:t>
+      </w:r>
+      <w:r>
+        <w:rPr/>
+        <w:t xml:space="preserve">"outlet_address_building": "Test Building </w:t>
+      </w:r>
+      <w:r>
+        <w:rPr/>
+        <w:t>3</w:t>
+      </w:r>
+      <w:r>
+        <w:rPr/>
+        <w:t>",</w:t>
+      </w:r>
+    </w:p>
+    <w:p>
+      <w:pPr>
+        <w:pStyle w:val="Normal"/>
+        <w:bidi w:val="0"/>
+        <w:jc w:val="start"/>
+        <w:rPr/>
+      </w:pPr>
+      <w:r>
+        <w:rPr/>
+        <w:t xml:space="preserve">            </w:t>
+      </w:r>
+      <w:r>
+        <w:rPr/>
+        <w:t xml:space="preserve">"outlet_address_street": "Test Street </w:t>
+      </w:r>
+      <w:r>
+        <w:rPr/>
+        <w:t>3</w:t>
+      </w:r>
+      <w:r>
+        <w:rPr/>
+        <w:t>",</w:t>
+      </w:r>
+    </w:p>
+    <w:p>
+      <w:pPr>
+        <w:pStyle w:val="Normal"/>
+        <w:bidi w:val="0"/>
+        <w:jc w:val="start"/>
+        <w:rPr/>
+      </w:pPr>
+      <w:r>
+        <w:rPr/>
+        <w:t xml:space="preserve">            </w:t>
+      </w:r>
+      <w:r>
+        <w:rPr/>
+        <w:t>"outlet_address_city": "Test City T</w:t>
+      </w:r>
+      <w:r>
+        <w:rPr/>
+        <w:t>hree</w:t>
+      </w:r>
+      <w:r>
+        <w:rPr/>
+        <w:t>",</w:t>
+      </w:r>
+    </w:p>
+    <w:p>
+      <w:pPr>
+        <w:pStyle w:val="Normal"/>
+        <w:bidi w:val="0"/>
+        <w:jc w:val="start"/>
+        <w:rPr/>
+      </w:pPr>
+      <w:r>
+        <w:rPr/>
+        <w:t xml:space="preserve">            </w:t>
+      </w:r>
+      <w:r>
+        <w:rPr/>
+        <w:t xml:space="preserve">"outlet_address_admin_division": "Test Division </w:t>
+      </w:r>
+      <w:r>
+        <w:rPr/>
+        <w:t>Three</w:t>
+      </w:r>
+      <w:r>
+        <w:rPr/>
+        <w:t>",</w:t>
+      </w:r>
+    </w:p>
+    <w:p>
+      <w:pPr>
+        <w:pStyle w:val="Normal"/>
+        <w:bidi w:val="0"/>
+        <w:jc w:val="start"/>
+        <w:rPr/>
+      </w:pPr>
+      <w:r>
+        <w:rPr/>
+        <w:t xml:space="preserve">            </w:t>
+      </w:r>
+      <w:r>
+        <w:rPr/>
+        <w:t>"outlet_address_country": "Saudi Arabia",</w:t>
+      </w:r>
+    </w:p>
+    <w:p>
+      <w:pPr>
+        <w:pStyle w:val="Normal"/>
+        <w:bidi w:val="0"/>
+        <w:jc w:val="start"/>
+        <w:rPr/>
+      </w:pPr>
+      <w:r>
+        <w:rPr/>
+        <w:t xml:space="preserve">            </w:t>
+      </w:r>
+      <w:r>
+        <w:rPr/>
+        <w:t>"outlet_address_post_code": "12345</w:t>
       </w:r>
       <w:r>
         <w:rPr/>
@@ -2639,10 +2443,552 @@
       </w:r>
       <w:r>
         <w:rPr/>
-        <w:t>.</w:t>
-      </w:r>
-      <w:bookmarkEnd w:id="7"/>
-      <w:bookmarkEnd w:id="8"/>
+        <w:t>",</w:t>
+      </w:r>
+    </w:p>
+    <w:p>
+      <w:pPr>
+        <w:pStyle w:val="Normal"/>
+        <w:bidi w:val="0"/>
+        <w:jc w:val="start"/>
+        <w:rPr/>
+      </w:pPr>
+      <w:r>
+        <w:rPr/>
+        <w:t xml:space="preserve">            </w:t>
+      </w:r>
+      <w:r>
+        <w:rPr/>
+        <w:t>"chain_id": 1</w:t>
+      </w:r>
+    </w:p>
+    <w:p>
+      <w:pPr>
+        <w:pStyle w:val="Normal"/>
+        <w:bidi w:val="0"/>
+        <w:jc w:val="start"/>
+        <w:rPr/>
+      </w:pPr>
+      <w:r>
+        <w:rPr/>
+        <w:t>}. This is an OUTLET with a duplicate outlet_name and its creation should fail and produce a database error. Catch that error. We are testing Entity Integrity of outlets table here.</w:t>
+      </w:r>
+    </w:p>
+    <w:p>
+      <w:pPr>
+        <w:pStyle w:val="Normal"/>
+        <w:bidi w:val="0"/>
+        <w:jc w:val="start"/>
+        <w:rPr/>
+      </w:pPr>
+      <w:r>
+        <w:rPr/>
+      </w:r>
+    </w:p>
+    <w:p>
+      <w:pPr>
+        <w:pStyle w:val="Normal"/>
+        <w:bidi w:val="0"/>
+        <w:jc w:val="start"/>
+        <w:rPr/>
+      </w:pPr>
+      <w:r>
+        <w:rPr/>
+        <w:t xml:space="preserve">* </w:t>
+      </w:r>
+      <w:bookmarkStart w:id="11" w:name="__DdeLink__273_4095027318"/>
+      <w:r>
+        <w:rPr/>
+        <w:t>Update the chain_id of the OUTLET that has outlet_name “Independent Test Outlet” to 2. This operation should be successful. Check that the respective chain_id has been updated to 2. The corresponding CHAIN should not be affected at all and there is no need to check this. We are testing how referential integrity works here.</w:t>
+      </w:r>
+      <w:bookmarkEnd w:id="11"/>
+    </w:p>
+    <w:p>
+      <w:pPr>
+        <w:pStyle w:val="Normal"/>
+        <w:bidi w:val="0"/>
+        <w:jc w:val="start"/>
+        <w:rPr/>
+      </w:pPr>
+      <w:r>
+        <w:rPr/>
+      </w:r>
+    </w:p>
+    <w:p>
+      <w:pPr>
+        <w:pStyle w:val="Normal"/>
+        <w:bidi w:val="0"/>
+        <w:jc w:val="start"/>
+        <w:rPr/>
+      </w:pPr>
+      <w:r>
+        <w:rPr/>
+        <w:t xml:space="preserve">* Update the chain_id of the OUTLET that has outlet_name “Independent Test Outlet” to NULL. </w:t>
+      </w:r>
+      <w:bookmarkStart w:id="12" w:name="__DdeLink__277_4095027318"/>
+      <w:r>
+        <w:rPr/>
+        <w:t>This operation should be successful.</w:t>
+      </w:r>
+      <w:bookmarkEnd w:id="12"/>
+      <w:r>
+        <w:rPr/>
+        <w:t xml:space="preserve"> Check that the respective chain_id has been updated to NULL. The corresponding CHAIN should not be affected at all and there is no need to check this. We are testing how referential integrity works here.</w:t>
+      </w:r>
+    </w:p>
+    <w:p>
+      <w:pPr>
+        <w:pStyle w:val="Normal"/>
+        <w:bidi w:val="0"/>
+        <w:jc w:val="start"/>
+        <w:rPr/>
+      </w:pPr>
+      <w:r>
+        <w:rPr/>
+      </w:r>
+    </w:p>
+    <w:p>
+      <w:pPr>
+        <w:pStyle w:val="Normal"/>
+        <w:bidi w:val="0"/>
+        <w:jc w:val="start"/>
+        <w:rPr/>
+      </w:pPr>
+      <w:r>
+        <w:rPr/>
+        <w:t>* Update the outlet_name of the OUTLET that has oulet_name “</w:t>
+      </w:r>
+      <w:bookmarkStart w:id="13" w:name="__DdeLink__283_4095027318"/>
+      <w:bookmarkStart w:id="14" w:name="__DdeLink__265_4095027318"/>
+      <w:r>
+        <w:rPr/>
+        <w:t>Tim Horton’s Test Outlet 2</w:t>
+      </w:r>
+      <w:bookmarkEnd w:id="13"/>
+      <w:bookmarkEnd w:id="14"/>
+      <w:r>
+        <w:rPr/>
+        <w:t xml:space="preserve">”. This operation should be successful. Check only that the respective outlet_name has been updated. The corresponding CHAIN should not be affected and there is no need to check this. </w:t>
+      </w:r>
+      <w:bookmarkStart w:id="15" w:name="__DdeLink__267_4095027318"/>
+      <w:r>
+        <w:rPr/>
+        <w:t>We are testing how referential integrity works here.</w:t>
+      </w:r>
+      <w:bookmarkEnd w:id="15"/>
+    </w:p>
+    <w:p>
+      <w:pPr>
+        <w:pStyle w:val="Normal"/>
+        <w:bidi w:val="0"/>
+        <w:jc w:val="start"/>
+        <w:rPr/>
+      </w:pPr>
+      <w:r>
+        <w:rPr/>
+      </w:r>
+    </w:p>
+    <w:p>
+      <w:pPr>
+        <w:pStyle w:val="Normal"/>
+        <w:bidi w:val="0"/>
+        <w:jc w:val="start"/>
+        <w:rPr/>
+      </w:pPr>
+      <w:bookmarkStart w:id="16" w:name="__DdeLink__285_4095027318"/>
+      <w:r>
+        <w:rPr/>
+        <w:t>* Update the outlet_address_room_no of the OUTLET that has outlet_name “Tim Horton’s Test Outlet 2” to NULL. This operation should be successful. Check that the respective outlet_address_room_no has been updated to NULL. We are testing absence of a NULL CONSTRAINT here.</w:t>
+      </w:r>
+      <w:bookmarkEnd w:id="16"/>
+    </w:p>
+    <w:p>
+      <w:pPr>
+        <w:pStyle w:val="Normal"/>
+        <w:bidi w:val="0"/>
+        <w:jc w:val="start"/>
+        <w:rPr/>
+      </w:pPr>
+      <w:r>
+        <w:rPr/>
+      </w:r>
+    </w:p>
+    <w:p>
+      <w:pPr>
+        <w:pStyle w:val="Normal"/>
+        <w:bidi w:val="0"/>
+        <w:jc w:val="start"/>
+        <w:rPr/>
+      </w:pPr>
+      <w:r>
+        <w:rPr/>
+        <w:t>* Update the outlet_address_room_no of the OUTLET that has outlet_name “Tim Horton’s Test Outlet 2” to “6”. This operation should be successful. Check that the respective outlet_address_room_no has been updated to “6”. We are testing whether a NULL value can be changed to a non-NULL value.</w:t>
+      </w:r>
+    </w:p>
+    <w:p>
+      <w:pPr>
+        <w:pStyle w:val="Normal"/>
+        <w:bidi w:val="0"/>
+        <w:jc w:val="start"/>
+        <w:rPr/>
+      </w:pPr>
+      <w:r>
+        <w:rPr/>
+      </w:r>
+    </w:p>
+    <w:p>
+      <w:pPr>
+        <w:pStyle w:val="Normal"/>
+        <w:bidi w:val="0"/>
+        <w:jc w:val="start"/>
+        <w:rPr/>
+      </w:pPr>
+      <w:r>
+        <w:rPr/>
+      </w:r>
+    </w:p>
+    <w:p>
+      <w:pPr>
+        <w:pStyle w:val="Normal"/>
+        <w:bidi w:val="0"/>
+        <w:jc w:val="start"/>
+        <w:rPr/>
+      </w:pPr>
+      <w:r>
+        <w:rPr/>
+        <w:t>* Update the chain_id of the OUTLET that has outlet_name “</w:t>
+      </w:r>
+      <w:bookmarkStart w:id="17" w:name="__DdeLink__287_4095027318"/>
+      <w:bookmarkStart w:id="18" w:name="__DdeLink__275_4095027318"/>
+      <w:r>
+        <w:rPr/>
+        <w:t>Tim Horton’s Test Outlet 2</w:t>
+      </w:r>
+      <w:bookmarkEnd w:id="17"/>
+      <w:bookmarkEnd w:id="18"/>
+      <w:r>
+        <w:rPr/>
+        <w:t xml:space="preserve">” to 2. This operation should be successful. </w:t>
+      </w:r>
+      <w:bookmarkStart w:id="19" w:name="__DdeLink__269_4095027318"/>
+      <w:r>
+        <w:rPr/>
+        <w:t xml:space="preserve">Check that the respective chain_id has been updated to 2. </w:t>
+      </w:r>
+      <w:bookmarkStart w:id="20" w:name="__DdeLink__280_4095027318"/>
+      <w:bookmarkStart w:id="21" w:name="__DdeLink__271_4095027318"/>
+      <w:bookmarkEnd w:id="19"/>
+      <w:r>
+        <w:rPr/>
+        <w:t>The corresponding CHAIN should not be affected at all and there is no need to check this. We are testing how referential integrity works here.</w:t>
+      </w:r>
+      <w:bookmarkEnd w:id="20"/>
+      <w:bookmarkEnd w:id="21"/>
+    </w:p>
+    <w:p>
+      <w:pPr>
+        <w:pStyle w:val="Normal"/>
+        <w:bidi w:val="0"/>
+        <w:jc w:val="start"/>
+        <w:rPr/>
+      </w:pPr>
+      <w:r>
+        <w:rPr/>
+      </w:r>
+    </w:p>
+    <w:p>
+      <w:pPr>
+        <w:pStyle w:val="Normal"/>
+        <w:bidi w:val="0"/>
+        <w:jc w:val="start"/>
+        <w:rPr/>
+      </w:pPr>
+      <w:r>
+        <w:rPr/>
+        <w:t>* Update the outlet_name of the OUTLET that has outlet_name “Tim Horton’s Test Outlet 2” to NULL. This operation should fail and produce a database error. Catch that error. We are testing a NOT NULL constraint on outlet_name here.</w:t>
+      </w:r>
+    </w:p>
+    <w:p>
+      <w:pPr>
+        <w:pStyle w:val="Normal"/>
+        <w:bidi w:val="0"/>
+        <w:jc w:val="start"/>
+        <w:rPr/>
+      </w:pPr>
+      <w:r>
+        <w:rPr/>
+      </w:r>
+    </w:p>
+    <w:p>
+      <w:pPr>
+        <w:pStyle w:val="Normal"/>
+        <w:bidi w:val="0"/>
+        <w:jc w:val="start"/>
+        <w:rPr/>
+      </w:pPr>
+      <w:r>
+        <w:rPr/>
+        <w:t xml:space="preserve">* Delete the OUTLET that has outlet_name “Tim Horton’s Test Outlet 2”. This operation should be successful. Check that this operation is successful. </w:t>
+      </w:r>
+      <w:bookmarkStart w:id="22" w:name="__DdeLink__271_4095027318_Copy_1"/>
+      <w:r>
+        <w:rPr/>
+        <w:t>The corresponding CHAIN should not be affected at all and there is no need to check this. We are testing how referential integrity works here.</w:t>
+      </w:r>
+      <w:bookmarkEnd w:id="22"/>
+    </w:p>
+    <w:p>
+      <w:pPr>
+        <w:pStyle w:val="Normal"/>
+        <w:bidi w:val="0"/>
+        <w:jc w:val="start"/>
+        <w:rPr/>
+      </w:pPr>
+      <w:r>
+        <w:rPr/>
+      </w:r>
+    </w:p>
+    <w:p>
+      <w:pPr>
+        <w:pStyle w:val="Normal"/>
+        <w:bidi w:val="0"/>
+        <w:jc w:val="start"/>
+        <w:rPr/>
+      </w:pPr>
+      <w:r>
+        <w:rPr/>
+        <w:t>* Create the OUTLET with the following details: {</w:t>
+      </w:r>
+    </w:p>
+    <w:p>
+      <w:pPr>
+        <w:pStyle w:val="Normal"/>
+        <w:bidi w:val="0"/>
+        <w:jc w:val="start"/>
+        <w:rPr/>
+      </w:pPr>
+      <w:r>
+        <w:rPr/>
+        <w:tab/>
+        <w:t>"outlet_name": "Tim Hortons Test Outlet 2",</w:t>
+      </w:r>
+    </w:p>
+    <w:p>
+      <w:pPr>
+        <w:pStyle w:val="Normal"/>
+        <w:bidi w:val="0"/>
+        <w:jc w:val="start"/>
+        <w:rPr/>
+      </w:pPr>
+      <w:r>
+        <w:rPr/>
+        <w:t xml:space="preserve">            </w:t>
+      </w:r>
+      <w:r>
+        <w:rPr/>
+        <w:t>"outlet_address_room_no": "5",</w:t>
+      </w:r>
+    </w:p>
+    <w:p>
+      <w:pPr>
+        <w:pStyle w:val="Normal"/>
+        <w:bidi w:val="0"/>
+        <w:jc w:val="start"/>
+        <w:rPr/>
+      </w:pPr>
+      <w:r>
+        <w:rPr/>
+        <w:t xml:space="preserve">            </w:t>
+      </w:r>
+      <w:r>
+        <w:rPr/>
+        <w:t>"outlet_address_building": "Test Building 2",</w:t>
+      </w:r>
+    </w:p>
+    <w:p>
+      <w:pPr>
+        <w:pStyle w:val="Normal"/>
+        <w:bidi w:val="0"/>
+        <w:jc w:val="start"/>
+        <w:rPr/>
+      </w:pPr>
+      <w:r>
+        <w:rPr/>
+        <w:t xml:space="preserve">            </w:t>
+      </w:r>
+      <w:r>
+        <w:rPr/>
+        <w:t>"outlet_address_street": "Test Street 2",</w:t>
+      </w:r>
+    </w:p>
+    <w:p>
+      <w:pPr>
+        <w:pStyle w:val="Normal"/>
+        <w:bidi w:val="0"/>
+        <w:jc w:val="start"/>
+        <w:rPr/>
+      </w:pPr>
+      <w:r>
+        <w:rPr/>
+        <w:t xml:space="preserve">            </w:t>
+      </w:r>
+      <w:r>
+        <w:rPr/>
+        <w:t>"outlet_address_city": "Test City Two",</w:t>
+      </w:r>
+    </w:p>
+    <w:p>
+      <w:pPr>
+        <w:pStyle w:val="Normal"/>
+        <w:bidi w:val="0"/>
+        <w:jc w:val="start"/>
+        <w:rPr/>
+      </w:pPr>
+      <w:r>
+        <w:rPr/>
+        <w:t xml:space="preserve">            </w:t>
+      </w:r>
+      <w:r>
+        <w:rPr/>
+        <w:t>"outlet_address_admin_division": "Test Division Two",</w:t>
+      </w:r>
+    </w:p>
+    <w:p>
+      <w:pPr>
+        <w:pStyle w:val="Normal"/>
+        <w:bidi w:val="0"/>
+        <w:jc w:val="start"/>
+        <w:rPr/>
+      </w:pPr>
+      <w:r>
+        <w:rPr/>
+        <w:t xml:space="preserve">            </w:t>
+      </w:r>
+      <w:r>
+        <w:rPr/>
+        <w:t>"outlet_address_country": "Saudi Arabia",</w:t>
+      </w:r>
+    </w:p>
+    <w:p>
+      <w:pPr>
+        <w:pStyle w:val="Normal"/>
+        <w:bidi w:val="0"/>
+        <w:jc w:val="start"/>
+        <w:rPr/>
+      </w:pPr>
+      <w:r>
+        <w:rPr/>
+        <w:t xml:space="preserve">            </w:t>
+      </w:r>
+      <w:r>
+        <w:rPr/>
+        <w:t>"outlet_address_post_code": "123457",</w:t>
+      </w:r>
+    </w:p>
+    <w:p>
+      <w:pPr>
+        <w:pStyle w:val="Normal"/>
+        <w:bidi w:val="0"/>
+        <w:jc w:val="start"/>
+        <w:rPr/>
+      </w:pPr>
+      <w:r>
+        <w:rPr/>
+        <w:t xml:space="preserve">            </w:t>
+      </w:r>
+      <w:r>
+        <w:rPr/>
+        <w:t>"chain_id": 1</w:t>
+      </w:r>
+    </w:p>
+    <w:p>
+      <w:pPr>
+        <w:pStyle w:val="Normal"/>
+        <w:bidi w:val="0"/>
+        <w:jc w:val="start"/>
+        <w:rPr/>
+      </w:pPr>
+      <w:r>
+        <w:rPr/>
+        <w:t>}. We are re-creating the OUTLET that we deleted so that the database tests can be run again.</w:t>
+      </w:r>
+    </w:p>
+    <w:p>
+      <w:pPr>
+        <w:pStyle w:val="Normal"/>
+        <w:bidi w:val="0"/>
+        <w:jc w:val="start"/>
+        <w:rPr/>
+      </w:pPr>
+      <w:r>
+        <w:rPr/>
+      </w:r>
+    </w:p>
+    <w:p>
+      <w:pPr>
+        <w:pStyle w:val="Normal"/>
+        <w:bidi w:val="0"/>
+        <w:jc w:val="start"/>
+        <w:rPr/>
+      </w:pPr>
+      <w:r>
+        <w:rPr/>
+      </w:r>
+    </w:p>
+    <w:p>
+      <w:pPr>
+        <w:pStyle w:val="Normal"/>
+        <w:bidi w:val="0"/>
+        <w:jc w:val="start"/>
+        <w:rPr/>
+      </w:pPr>
+      <w:r>
+        <w:rPr/>
+      </w:r>
+    </w:p>
+    <w:p>
+      <w:pPr>
+        <w:pStyle w:val="Normal"/>
+        <w:bidi w:val="0"/>
+        <w:jc w:val="start"/>
+        <w:rPr/>
+      </w:pPr>
+      <w:r>
+        <w:rPr/>
+      </w:r>
+    </w:p>
+    <w:p>
+      <w:pPr>
+        <w:pStyle w:val="Normal"/>
+        <w:bidi w:val="0"/>
+        <w:jc w:val="start"/>
+        <w:rPr/>
+      </w:pPr>
+      <w:r>
+        <w:rPr/>
+      </w:r>
+    </w:p>
+    <w:p>
+      <w:pPr>
+        <w:pStyle w:val="Normal"/>
+        <w:bidi w:val="0"/>
+        <w:jc w:val="start"/>
+        <w:rPr/>
+      </w:pPr>
+      <w:r>
+        <w:rPr/>
+      </w:r>
+    </w:p>
+    <w:p>
+      <w:pPr>
+        <w:pStyle w:val="Normal"/>
+        <w:bidi w:val="0"/>
+        <w:jc w:val="start"/>
+        <w:rPr/>
+      </w:pPr>
+      <w:r>
+        <w:rPr/>
+      </w:r>
     </w:p>
     <w:sectPr>
       <w:type w:val="nextPage"/>
@@ -2681,9 +3027,7 @@
     <w:pPr>
       <w:widowControl/>
       <w:suppressAutoHyphens w:val="true"/>
-      <w:kinsoku w:val="true"/>
-      <w:overflowPunct w:val="true"/>
-      <w:autoSpaceDE w:val="true"/>
+      <w:overflowPunct w:val="false"/>
       <w:bidi w:val="0"/>
       <w:spacing w:before="0" w:after="0"/>
       <w:jc w:val="start"/>

</xml_diff>

<commit_message>
Created database tests for outlets. OUTLETS PASSED ALL DATABASE TESTS  SUCCESSFULLY.
</commit_message>
<xml_diff>
--- a/Portal_Database_Design/Outlet_APIs.docx
+++ b/Portal_Database_Design/Outlet_APIs.docx
@@ -16,17 +16,17 @@
         </w:tblCellMar>
       </w:tblPr>
       <w:tblGrid>
-        <w:gridCol w:w="1924"/>
-        <w:gridCol w:w="1931"/>
-        <w:gridCol w:w="1924"/>
-        <w:gridCol w:w="1931"/>
+        <w:gridCol w:w="1923"/>
+        <w:gridCol w:w="1932"/>
+        <w:gridCol w:w="1923"/>
+        <w:gridCol w:w="1932"/>
         <w:gridCol w:w="1928"/>
       </w:tblGrid>
       <w:tr>
         <w:trPr/>
         <w:tc>
           <w:tcPr>
-            <w:tcW w:w="1924" w:type="dxa"/>
+            <w:tcW w:w="1923" w:type="dxa"/>
             <w:tcBorders>
               <w:top w:val="single" w:sz="4" w:space="0" w:color="000000"/>
               <w:start w:val="single" w:sz="4" w:space="0" w:color="000000"/>
@@ -76,7 +76,7 @@
         </w:tc>
         <w:tc>
           <w:tcPr>
-            <w:tcW w:w="1931" w:type="dxa"/>
+            <w:tcW w:w="1932" w:type="dxa"/>
             <w:tcBorders>
               <w:top w:val="single" w:sz="4" w:space="0" w:color="000000"/>
               <w:start w:val="single" w:sz="4" w:space="0" w:color="000000"/>
@@ -126,7 +126,7 @@
         </w:tc>
         <w:tc>
           <w:tcPr>
-            <w:tcW w:w="1924" w:type="dxa"/>
+            <w:tcW w:w="1923" w:type="dxa"/>
             <w:tcBorders>
               <w:top w:val="single" w:sz="4" w:space="0" w:color="000000"/>
               <w:start w:val="single" w:sz="4" w:space="0" w:color="000000"/>
@@ -176,7 +176,7 @@
         </w:tc>
         <w:tc>
           <w:tcPr>
-            <w:tcW w:w="1931" w:type="dxa"/>
+            <w:tcW w:w="1932" w:type="dxa"/>
             <w:tcBorders>
               <w:top w:val="single" w:sz="4" w:space="0" w:color="000000"/>
               <w:start w:val="single" w:sz="4" w:space="0" w:color="000000"/>
@@ -280,7 +280,7 @@
         <w:trPr/>
         <w:tc>
           <w:tcPr>
-            <w:tcW w:w="1924" w:type="dxa"/>
+            <w:tcW w:w="1923" w:type="dxa"/>
             <w:tcBorders>
               <w:start w:val="single" w:sz="4" w:space="0" w:color="000000"/>
               <w:bottom w:val="single" w:sz="4" w:space="0" w:color="000000"/>
@@ -329,7 +329,7 @@
         </w:tc>
         <w:tc>
           <w:tcPr>
-            <w:tcW w:w="1931" w:type="dxa"/>
+            <w:tcW w:w="1932" w:type="dxa"/>
             <w:tcBorders>
               <w:start w:val="single" w:sz="4" w:space="0" w:color="000000"/>
               <w:bottom w:val="single" w:sz="4" w:space="0" w:color="000000"/>
@@ -378,7 +378,7 @@
         </w:tc>
         <w:tc>
           <w:tcPr>
-            <w:tcW w:w="1924" w:type="dxa"/>
+            <w:tcW w:w="1923" w:type="dxa"/>
             <w:tcBorders>
               <w:start w:val="single" w:sz="4" w:space="0" w:color="000000"/>
               <w:bottom w:val="single" w:sz="4" w:space="0" w:color="000000"/>
@@ -427,7 +427,7 @@
         </w:tc>
         <w:tc>
           <w:tcPr>
-            <w:tcW w:w="1931" w:type="dxa"/>
+            <w:tcW w:w="1932" w:type="dxa"/>
             <w:tcBorders>
               <w:start w:val="single" w:sz="4" w:space="0" w:color="000000"/>
               <w:bottom w:val="single" w:sz="4" w:space="0" w:color="000000"/>
@@ -529,7 +529,7 @@
         <w:trPr/>
         <w:tc>
           <w:tcPr>
-            <w:tcW w:w="1924" w:type="dxa"/>
+            <w:tcW w:w="1923" w:type="dxa"/>
             <w:tcBorders>
               <w:start w:val="single" w:sz="4" w:space="0" w:color="000000"/>
               <w:bottom w:val="single" w:sz="4" w:space="0" w:color="000000"/>
@@ -578,7 +578,7 @@
         </w:tc>
         <w:tc>
           <w:tcPr>
-            <w:tcW w:w="1931" w:type="dxa"/>
+            <w:tcW w:w="1932" w:type="dxa"/>
             <w:tcBorders>
               <w:start w:val="single" w:sz="4" w:space="0" w:color="000000"/>
               <w:bottom w:val="single" w:sz="4" w:space="0" w:color="000000"/>
@@ -627,7 +627,7 @@
         </w:tc>
         <w:tc>
           <w:tcPr>
-            <w:tcW w:w="1924" w:type="dxa"/>
+            <w:tcW w:w="1923" w:type="dxa"/>
             <w:tcBorders>
               <w:start w:val="single" w:sz="4" w:space="0" w:color="000000"/>
               <w:bottom w:val="single" w:sz="4" w:space="0" w:color="000000"/>
@@ -676,7 +676,7 @@
         </w:tc>
         <w:tc>
           <w:tcPr>
-            <w:tcW w:w="1931" w:type="dxa"/>
+            <w:tcW w:w="1932" w:type="dxa"/>
             <w:tcBorders>
               <w:start w:val="single" w:sz="4" w:space="0" w:color="000000"/>
               <w:bottom w:val="single" w:sz="4" w:space="0" w:color="000000"/>
@@ -778,7 +778,7 @@
         <w:trPr/>
         <w:tc>
           <w:tcPr>
-            <w:tcW w:w="1924" w:type="dxa"/>
+            <w:tcW w:w="1923" w:type="dxa"/>
             <w:tcBorders>
               <w:start w:val="single" w:sz="4" w:space="0" w:color="000000"/>
               <w:bottom w:val="single" w:sz="4" w:space="0" w:color="000000"/>
@@ -827,7 +827,7 @@
         </w:tc>
         <w:tc>
           <w:tcPr>
-            <w:tcW w:w="1931" w:type="dxa"/>
+            <w:tcW w:w="1932" w:type="dxa"/>
             <w:tcBorders>
               <w:start w:val="single" w:sz="4" w:space="0" w:color="000000"/>
               <w:bottom w:val="single" w:sz="4" w:space="0" w:color="000000"/>
@@ -876,7 +876,7 @@
         </w:tc>
         <w:tc>
           <w:tcPr>
-            <w:tcW w:w="1924" w:type="dxa"/>
+            <w:tcW w:w="1923" w:type="dxa"/>
             <w:tcBorders>
               <w:start w:val="single" w:sz="4" w:space="0" w:color="000000"/>
               <w:bottom w:val="single" w:sz="4" w:space="0" w:color="000000"/>
@@ -925,7 +925,7 @@
         </w:tc>
         <w:tc>
           <w:tcPr>
-            <w:tcW w:w="1931" w:type="dxa"/>
+            <w:tcW w:w="1932" w:type="dxa"/>
             <w:tcBorders>
               <w:start w:val="single" w:sz="4" w:space="0" w:color="000000"/>
               <w:bottom w:val="single" w:sz="4" w:space="0" w:color="000000"/>
@@ -1027,7 +1027,7 @@
         <w:trPr/>
         <w:tc>
           <w:tcPr>
-            <w:tcW w:w="1924" w:type="dxa"/>
+            <w:tcW w:w="1923" w:type="dxa"/>
             <w:tcBorders>
               <w:start w:val="single" w:sz="4" w:space="0" w:color="000000"/>
               <w:bottom w:val="single" w:sz="4" w:space="0" w:color="000000"/>
@@ -1076,7 +1076,7 @@
         </w:tc>
         <w:tc>
           <w:tcPr>
-            <w:tcW w:w="1931" w:type="dxa"/>
+            <w:tcW w:w="1932" w:type="dxa"/>
             <w:tcBorders>
               <w:start w:val="single" w:sz="4" w:space="0" w:color="000000"/>
               <w:bottom w:val="single" w:sz="4" w:space="0" w:color="000000"/>
@@ -1125,7 +1125,7 @@
         </w:tc>
         <w:tc>
           <w:tcPr>
-            <w:tcW w:w="1924" w:type="dxa"/>
+            <w:tcW w:w="1923" w:type="dxa"/>
             <w:tcBorders>
               <w:start w:val="single" w:sz="4" w:space="0" w:color="000000"/>
               <w:bottom w:val="single" w:sz="4" w:space="0" w:color="000000"/>
@@ -1174,7 +1174,7 @@
         </w:tc>
         <w:tc>
           <w:tcPr>
-            <w:tcW w:w="1931" w:type="dxa"/>
+            <w:tcW w:w="1932" w:type="dxa"/>
             <w:tcBorders>
               <w:start w:val="single" w:sz="4" w:space="0" w:color="000000"/>
               <w:bottom w:val="single" w:sz="4" w:space="0" w:color="000000"/>
@@ -1276,7 +1276,7 @@
         <w:trPr/>
         <w:tc>
           <w:tcPr>
-            <w:tcW w:w="1924" w:type="dxa"/>
+            <w:tcW w:w="1923" w:type="dxa"/>
             <w:tcBorders>
               <w:start w:val="single" w:sz="4" w:space="0" w:color="000000"/>
               <w:bottom w:val="single" w:sz="4" w:space="0" w:color="000000"/>
@@ -1325,7 +1325,7 @@
         </w:tc>
         <w:tc>
           <w:tcPr>
-            <w:tcW w:w="1931" w:type="dxa"/>
+            <w:tcW w:w="1932" w:type="dxa"/>
             <w:tcBorders>
               <w:start w:val="single" w:sz="4" w:space="0" w:color="000000"/>
               <w:bottom w:val="single" w:sz="4" w:space="0" w:color="000000"/>
@@ -1374,7 +1374,7 @@
         </w:tc>
         <w:tc>
           <w:tcPr>
-            <w:tcW w:w="1924" w:type="dxa"/>
+            <w:tcW w:w="1923" w:type="dxa"/>
             <w:tcBorders>
               <w:start w:val="single" w:sz="4" w:space="0" w:color="000000"/>
               <w:bottom w:val="single" w:sz="4" w:space="0" w:color="000000"/>
@@ -1423,7 +1423,7 @@
         </w:tc>
         <w:tc>
           <w:tcPr>
-            <w:tcW w:w="1931" w:type="dxa"/>
+            <w:tcW w:w="1932" w:type="dxa"/>
             <w:tcBorders>
               <w:start w:val="single" w:sz="4" w:space="0" w:color="000000"/>
               <w:bottom w:val="single" w:sz="4" w:space="0" w:color="000000"/>
@@ -1525,7 +1525,7 @@
         <w:trPr/>
         <w:tc>
           <w:tcPr>
-            <w:tcW w:w="1924" w:type="dxa"/>
+            <w:tcW w:w="1923" w:type="dxa"/>
             <w:tcBorders>
               <w:start w:val="single" w:sz="4" w:space="0" w:color="000000"/>
               <w:bottom w:val="single" w:sz="4" w:space="0" w:color="000000"/>
@@ -1574,7 +1574,7 @@
         </w:tc>
         <w:tc>
           <w:tcPr>
-            <w:tcW w:w="1931" w:type="dxa"/>
+            <w:tcW w:w="1932" w:type="dxa"/>
             <w:tcBorders>
               <w:start w:val="single" w:sz="4" w:space="0" w:color="000000"/>
               <w:bottom w:val="single" w:sz="4" w:space="0" w:color="000000"/>
@@ -1623,7 +1623,7 @@
         </w:tc>
         <w:tc>
           <w:tcPr>
-            <w:tcW w:w="1924" w:type="dxa"/>
+            <w:tcW w:w="1923" w:type="dxa"/>
             <w:tcBorders>
               <w:start w:val="single" w:sz="4" w:space="0" w:color="000000"/>
               <w:bottom w:val="single" w:sz="4" w:space="0" w:color="000000"/>
@@ -1672,7 +1672,7 @@
         </w:tc>
         <w:tc>
           <w:tcPr>
-            <w:tcW w:w="1931" w:type="dxa"/>
+            <w:tcW w:w="1932" w:type="dxa"/>
             <w:tcBorders>
               <w:start w:val="single" w:sz="4" w:space="0" w:color="000000"/>
               <w:bottom w:val="single" w:sz="4" w:space="0" w:color="000000"/>
@@ -2183,8 +2183,6 @@
         <w:jc w:val="start"/>
         <w:rPr/>
       </w:pPr>
-      <w:bookmarkStart w:id="7" w:name="__DdeLink__139_2312781727"/>
-      <w:bookmarkStart w:id="8" w:name="__DdeLink__142_2312781727"/>
       <w:r>
         <w:rPr/>
         <w:t>For removeOutlet, the following tests:</w:t>
@@ -2221,33 +2219,36 @@
         <w:jc w:val="start"/>
         <w:rPr/>
       </w:pPr>
-      <w:bookmarkStart w:id="9" w:name="__DdeLink__139_2312781727"/>
-      <w:bookmarkStart w:id="10" w:name="__DdeLink__142_2312781727"/>
+      <w:bookmarkStart w:id="7" w:name="__DdeLink__142_2312781727"/>
+      <w:bookmarkStart w:id="8" w:name="__DdeLink__139_2312781727"/>
       <w:r>
         <w:rPr/>
         <w:t>* Delete the OUTLET with outlet_id 8.</w:t>
       </w:r>
-      <w:bookmarkEnd w:id="9"/>
+      <w:bookmarkEnd w:id="7"/>
+      <w:bookmarkEnd w:id="8"/>
+    </w:p>
+    <w:p>
+      <w:pPr>
+        <w:pStyle w:val="Normal"/>
+        <w:bidi w:val="0"/>
+        <w:jc w:val="start"/>
+        <w:rPr/>
+      </w:pPr>
+      <w:r>
+        <w:rPr/>
+      </w:r>
+    </w:p>
+    <w:p>
+      <w:pPr>
+        <w:pStyle w:val="Normal"/>
+        <w:bidi w:val="0"/>
+        <w:jc w:val="center"/>
+        <w:rPr/>
+      </w:pPr>
+      <w:bookmarkStart w:id="9" w:name="__DdeLink__290_2149420322"/>
+      <w:bookmarkStart w:id="10" w:name="__DdeLink__273_2149420322"/>
       <w:bookmarkEnd w:id="10"/>
-    </w:p>
-    <w:p>
-      <w:pPr>
-        <w:pStyle w:val="Normal"/>
-        <w:bidi w:val="0"/>
-        <w:jc w:val="start"/>
-        <w:rPr/>
-      </w:pPr>
-      <w:r>
-        <w:rPr/>
-      </w:r>
-    </w:p>
-    <w:p>
-      <w:pPr>
-        <w:pStyle w:val="Normal"/>
-        <w:bidi w:val="0"/>
-        <w:jc w:val="center"/>
-        <w:rPr/>
-      </w:pPr>
       <w:r>
         <w:rPr/>
         <w:t>DATABASE TESTS</w:t>
@@ -2260,17 +2261,10 @@
         <w:jc w:val="start"/>
         <w:rPr/>
       </w:pPr>
-      <w:r>
-        <w:rPr/>
-        <w:t xml:space="preserve">* </w:t>
-      </w:r>
-      <w:r>
-        <w:rPr/>
-        <w:t xml:space="preserve">Create </w:t>
-      </w:r>
-      <w:r>
-        <w:rPr/>
-        <w:t>an OUTLET as {</w:t>
+      <w:bookmarkStart w:id="11" w:name="__DdeLink__275_2149420322"/>
+      <w:r>
+        <w:rPr/>
+        <w:t>* Create an OUTLET as {</w:t>
       </w:r>
     </w:p>
     <w:p>
@@ -2299,15 +2293,7 @@
       </w:r>
       <w:r>
         <w:rPr/>
-        <w:t>"outlet_address_room_no": "</w:t>
-      </w:r>
-      <w:r>
-        <w:rPr/>
-        <w:t>6</w:t>
-      </w:r>
-      <w:r>
-        <w:rPr/>
-        <w:t>",</w:t>
+        <w:t>"outlet_address_room_no": "6",</w:t>
       </w:r>
     </w:p>
     <w:p>
@@ -2323,15 +2309,7 @@
       </w:r>
       <w:r>
         <w:rPr/>
-        <w:t xml:space="preserve">"outlet_address_building": "Test Building </w:t>
-      </w:r>
-      <w:r>
-        <w:rPr/>
-        <w:t>3</w:t>
-      </w:r>
-      <w:r>
-        <w:rPr/>
-        <w:t>",</w:t>
+        <w:t>"outlet_address_building": "Test Building 3",</w:t>
       </w:r>
     </w:p>
     <w:p>
@@ -2347,15 +2325,7 @@
       </w:r>
       <w:r>
         <w:rPr/>
-        <w:t xml:space="preserve">"outlet_address_street": "Test Street </w:t>
-      </w:r>
-      <w:r>
-        <w:rPr/>
-        <w:t>3</w:t>
-      </w:r>
-      <w:r>
-        <w:rPr/>
-        <w:t>",</w:t>
+        <w:t>"outlet_address_street": "Test Street 3",</w:t>
       </w:r>
     </w:p>
     <w:p>
@@ -2371,15 +2341,7 @@
       </w:r>
       <w:r>
         <w:rPr/>
-        <w:t>"outlet_address_city": "Test City T</w:t>
-      </w:r>
-      <w:r>
-        <w:rPr/>
-        <w:t>hree</w:t>
-      </w:r>
-      <w:r>
-        <w:rPr/>
-        <w:t>",</w:t>
+        <w:t>"outlet_address_city": "Test City Three",</w:t>
       </w:r>
     </w:p>
     <w:p>
@@ -2395,15 +2357,7 @@
       </w:r>
       <w:r>
         <w:rPr/>
-        <w:t xml:space="preserve">"outlet_address_admin_division": "Test Division </w:t>
-      </w:r>
-      <w:r>
-        <w:rPr/>
-        <w:t>Three</w:t>
-      </w:r>
-      <w:r>
-        <w:rPr/>
-        <w:t>",</w:t>
+        <w:t>"outlet_address_admin_division": "Test Division Three",</w:t>
       </w:r>
     </w:p>
     <w:p>
@@ -2435,15 +2389,7 @@
       </w:r>
       <w:r>
         <w:rPr/>
-        <w:t>"outlet_address_post_code": "12345</w:t>
-      </w:r>
-      <w:r>
-        <w:rPr/>
-        <w:t>8</w:t>
-      </w:r>
-      <w:r>
-        <w:rPr/>
-        <w:t>",</w:t>
+        <w:t>"outlet_address_post_code": "123458",</w:t>
       </w:r>
     </w:p>
     <w:p>
@@ -2469,10 +2415,12 @@
         <w:jc w:val="start"/>
         <w:rPr/>
       </w:pPr>
+      <w:bookmarkStart w:id="12" w:name="__DdeLink__275_2149420322"/>
       <w:r>
         <w:rPr/>
         <w:t>}. This is an OUTLET with a duplicate outlet_name and its creation should fail and produce a database error. Catch that error. We are testing Entity Integrity of outlets table here.</w:t>
       </w:r>
+      <w:bookmarkEnd w:id="12"/>
     </w:p>
     <w:p>
       <w:pPr>
@@ -2496,12 +2444,12 @@
         <w:rPr/>
         <w:t xml:space="preserve">* </w:t>
       </w:r>
-      <w:bookmarkStart w:id="11" w:name="__DdeLink__273_4095027318"/>
+      <w:bookmarkStart w:id="13" w:name="__DdeLink__273_4095027318"/>
       <w:r>
         <w:rPr/>
         <w:t>Update the chain_id of the OUTLET that has outlet_name “Independent Test Outlet” to 2. This operation should be successful. Check that the respective chain_id has been updated to 2. The corresponding CHAIN should not be affected at all and there is no need to check this. We are testing how referential integrity works here.</w:t>
       </w:r>
-      <w:bookmarkEnd w:id="11"/>
+      <w:bookmarkEnd w:id="13"/>
     </w:p>
     <w:p>
       <w:pPr>
@@ -2525,12 +2473,12 @@
         <w:rPr/>
         <w:t xml:space="preserve">* Update the chain_id of the OUTLET that has outlet_name “Independent Test Outlet” to NULL. </w:t>
       </w:r>
-      <w:bookmarkStart w:id="12" w:name="__DdeLink__277_4095027318"/>
+      <w:bookmarkStart w:id="14" w:name="__DdeLink__277_4095027318"/>
       <w:r>
         <w:rPr/>
         <w:t>This operation should be successful.</w:t>
       </w:r>
-      <w:bookmarkEnd w:id="12"/>
+      <w:bookmarkEnd w:id="14"/>
       <w:r>
         <w:rPr/>
         <w:t xml:space="preserve"> Check that the respective chain_id has been updated to NULL. The corresponding CHAIN should not be affected at all and there is no need to check this. We are testing how referential integrity works here.</w:t>
@@ -2558,49 +2506,49 @@
         <w:rPr/>
         <w:t>* Update the outlet_name of the OUTLET that has oulet_name “</w:t>
       </w:r>
-      <w:bookmarkStart w:id="13" w:name="__DdeLink__283_4095027318"/>
-      <w:bookmarkStart w:id="14" w:name="__DdeLink__265_4095027318"/>
+      <w:bookmarkStart w:id="15" w:name="__DdeLink__265_4095027318"/>
+      <w:bookmarkStart w:id="16" w:name="__DdeLink__283_4095027318"/>
       <w:r>
         <w:rPr/>
         <w:t>Tim Horton’s Test Outlet 2</w:t>
       </w:r>
-      <w:bookmarkEnd w:id="13"/>
-      <w:bookmarkEnd w:id="14"/>
+      <w:bookmarkEnd w:id="15"/>
+      <w:bookmarkEnd w:id="16"/>
       <w:r>
         <w:rPr/>
         <w:t xml:space="preserve">”. This operation should be successful. Check only that the respective outlet_name has been updated. The corresponding CHAIN should not be affected and there is no need to check this. </w:t>
       </w:r>
-      <w:bookmarkStart w:id="15" w:name="__DdeLink__267_4095027318"/>
+      <w:bookmarkStart w:id="17" w:name="__DdeLink__267_4095027318"/>
       <w:r>
         <w:rPr/>
         <w:t>We are testing how referential integrity works here.</w:t>
       </w:r>
-      <w:bookmarkEnd w:id="15"/>
-    </w:p>
-    <w:p>
-      <w:pPr>
-        <w:pStyle w:val="Normal"/>
-        <w:bidi w:val="0"/>
-        <w:jc w:val="start"/>
-        <w:rPr/>
-      </w:pPr>
-      <w:r>
-        <w:rPr/>
-      </w:r>
-    </w:p>
-    <w:p>
-      <w:pPr>
-        <w:pStyle w:val="Normal"/>
-        <w:bidi w:val="0"/>
-        <w:jc w:val="start"/>
-        <w:rPr/>
-      </w:pPr>
-      <w:bookmarkStart w:id="16" w:name="__DdeLink__285_4095027318"/>
+      <w:bookmarkEnd w:id="17"/>
+    </w:p>
+    <w:p>
+      <w:pPr>
+        <w:pStyle w:val="Normal"/>
+        <w:bidi w:val="0"/>
+        <w:jc w:val="start"/>
+        <w:rPr/>
+      </w:pPr>
+      <w:r>
+        <w:rPr/>
+      </w:r>
+    </w:p>
+    <w:p>
+      <w:pPr>
+        <w:pStyle w:val="Normal"/>
+        <w:bidi w:val="0"/>
+        <w:jc w:val="start"/>
+        <w:rPr/>
+      </w:pPr>
+      <w:bookmarkStart w:id="18" w:name="__DdeLink__285_4095027318"/>
       <w:r>
         <w:rPr/>
         <w:t>* Update the outlet_address_room_no of the OUTLET that has outlet_name “Tim Horton’s Test Outlet 2” to NULL. This operation should be successful. Check that the respective outlet_address_room_no has been updated to NULL. We are testing absence of a NULL CONSTRAINT here.</w:t>
       </w:r>
-      <w:bookmarkEnd w:id="16"/>
+      <w:bookmarkEnd w:id="18"/>
     </w:p>
     <w:p>
       <w:pPr>
@@ -2658,32 +2606,32 @@
         <w:rPr/>
         <w:t>* Update the chain_id of the OUTLET that has outlet_name “</w:t>
       </w:r>
-      <w:bookmarkStart w:id="17" w:name="__DdeLink__287_4095027318"/>
-      <w:bookmarkStart w:id="18" w:name="__DdeLink__275_4095027318"/>
+      <w:bookmarkStart w:id="19" w:name="__DdeLink__275_4095027318"/>
+      <w:bookmarkStart w:id="20" w:name="__DdeLink__287_4095027318"/>
       <w:r>
         <w:rPr/>
         <w:t>Tim Horton’s Test Outlet 2</w:t>
       </w:r>
-      <w:bookmarkEnd w:id="17"/>
-      <w:bookmarkEnd w:id="18"/>
+      <w:bookmarkEnd w:id="19"/>
+      <w:bookmarkEnd w:id="20"/>
       <w:r>
         <w:rPr/>
         <w:t xml:space="preserve">” to 2. This operation should be successful. </w:t>
       </w:r>
-      <w:bookmarkStart w:id="19" w:name="__DdeLink__269_4095027318"/>
+      <w:bookmarkStart w:id="21" w:name="__DdeLink__269_4095027318"/>
       <w:r>
         <w:rPr/>
         <w:t xml:space="preserve">Check that the respective chain_id has been updated to 2. </w:t>
       </w:r>
-      <w:bookmarkStart w:id="20" w:name="__DdeLink__280_4095027318"/>
-      <w:bookmarkStart w:id="21" w:name="__DdeLink__271_4095027318"/>
-      <w:bookmarkEnd w:id="19"/>
+      <w:bookmarkStart w:id="22" w:name="__DdeLink__271_4095027318"/>
+      <w:bookmarkStart w:id="23" w:name="__DdeLink__280_4095027318"/>
+      <w:bookmarkEnd w:id="21"/>
       <w:r>
         <w:rPr/>
         <w:t>The corresponding CHAIN should not be affected at all and there is no need to check this. We are testing how referential integrity works here.</w:t>
       </w:r>
-      <w:bookmarkEnd w:id="20"/>
-      <w:bookmarkEnd w:id="21"/>
+      <w:bookmarkEnd w:id="22"/>
+      <w:bookmarkEnd w:id="23"/>
     </w:p>
     <w:p>
       <w:pPr>
@@ -2730,12 +2678,12 @@
         <w:rPr/>
         <w:t xml:space="preserve">* Delete the OUTLET that has outlet_name “Tim Horton’s Test Outlet 2”. This operation should be successful. Check that this operation is successful. </w:t>
       </w:r>
-      <w:bookmarkStart w:id="22" w:name="__DdeLink__271_4095027318_Copy_1"/>
+      <w:bookmarkStart w:id="24" w:name="__DdeLink__271_4095027318_Copy_1"/>
       <w:r>
         <w:rPr/>
         <w:t>The corresponding CHAIN should not be affected at all and there is no need to check this. We are testing how referential integrity works here.</w:t>
       </w:r>
-      <w:bookmarkEnd w:id="22"/>
+      <w:bookmarkEnd w:id="24"/>
     </w:p>
     <w:p>
       <w:pPr>
@@ -2908,21 +2856,26 @@
         <w:jc w:val="start"/>
         <w:rPr/>
       </w:pPr>
+      <w:bookmarkStart w:id="25" w:name="__DdeLink__290_2149420322"/>
       <w:r>
         <w:rPr/>
         <w:t>}. We are re-creating the OUTLET that we deleted so that the database tests can be run again.</w:t>
       </w:r>
-    </w:p>
-    <w:p>
-      <w:pPr>
-        <w:pStyle w:val="Normal"/>
-        <w:bidi w:val="0"/>
-        <w:jc w:val="start"/>
-        <w:rPr/>
-      </w:pPr>
-      <w:r>
-        <w:rPr/>
-      </w:r>
+      <w:bookmarkEnd w:id="25"/>
+    </w:p>
+    <w:p>
+      <w:pPr>
+        <w:pStyle w:val="Normal"/>
+        <w:bidi w:val="0"/>
+        <w:jc w:val="start"/>
+        <w:rPr/>
+      </w:pPr>
+      <w:r>
+        <w:rPr/>
+      </w:r>
+      <w:bookmarkStart w:id="26" w:name="__DdeLink__273_2149420322"/>
+      <w:bookmarkStart w:id="27" w:name="__DdeLink__273_2149420322"/>
+      <w:bookmarkEnd w:id="27"/>
     </w:p>
     <w:p>
       <w:pPr>
@@ -3027,7 +2980,7 @@
     <w:pPr>
       <w:widowControl/>
       <w:suppressAutoHyphens w:val="true"/>
-      <w:overflowPunct w:val="false"/>
+      <w:overflowPunct w:val="true"/>
       <w:bidi w:val="0"/>
       <w:spacing w:before="0" w:after="0"/>
       <w:jc w:val="start"/>

</xml_diff>